<commit_message>
feat: replace mock screenshots with real application UI captures in report and docs
</commit_message>
<xml_diff>
--- a/Bao_Cao_De_Tai_Topic_8_MiniEcommerce_CapNhat.docx
+++ b/Bao_Cao_De_Tai_Topic_8_MiniEcommerce_CapNhat.docx
@@ -4150,7 +4150,7 @@
       <w:r>
         <w:drawing>
           <wp:inline xmlns:a="http://schemas.openxmlformats.org/drawingml/2006/main" xmlns:pic="http://schemas.openxmlformats.org/drawingml/2006/picture">
-            <wp:extent cx="5486400" cy="3062177"/>
+            <wp:extent cx="5486400" cy="3526971"/>
             <wp:docPr id="4" name="Picture 4"/>
             <wp:cNvGraphicFramePr>
               <a:graphicFrameLocks noChangeAspect="1"/>
@@ -4171,7 +4171,7 @@
                   <pic:spPr>
                     <a:xfrm>
                       <a:off x="0" y="0"/>
-                      <a:ext cx="5486400" cy="3062177"/>
+                      <a:ext cx="5486400" cy="3526971"/>
                     </a:xfrm>
                     <a:prstGeom prst="rect"/>
                   </pic:spPr>
@@ -4204,7 +4204,7 @@
       <w:r>
         <w:drawing>
           <wp:inline xmlns:a="http://schemas.openxmlformats.org/drawingml/2006/main" xmlns:pic="http://schemas.openxmlformats.org/drawingml/2006/picture">
-            <wp:extent cx="5486400" cy="3062177"/>
+            <wp:extent cx="5486400" cy="3526971"/>
             <wp:docPr id="5" name="Picture 5"/>
             <wp:cNvGraphicFramePr>
               <a:graphicFrameLocks noChangeAspect="1"/>
@@ -4225,7 +4225,7 @@
                   <pic:spPr>
                     <a:xfrm>
                       <a:off x="0" y="0"/>
-                      <a:ext cx="5486400" cy="3062177"/>
+                      <a:ext cx="5486400" cy="3526971"/>
                     </a:xfrm>
                     <a:prstGeom prst="rect"/>
                   </pic:spPr>
@@ -4258,7 +4258,7 @@
       <w:r>
         <w:drawing>
           <wp:inline xmlns:a="http://schemas.openxmlformats.org/drawingml/2006/main" xmlns:pic="http://schemas.openxmlformats.org/drawingml/2006/picture">
-            <wp:extent cx="5486400" cy="3062177"/>
+            <wp:extent cx="5486400" cy="3526971"/>
             <wp:docPr id="6" name="Picture 6"/>
             <wp:cNvGraphicFramePr>
               <a:graphicFrameLocks noChangeAspect="1"/>
@@ -4279,7 +4279,7 @@
                   <pic:spPr>
                     <a:xfrm>
                       <a:off x="0" y="0"/>
-                      <a:ext cx="5486400" cy="3062177"/>
+                      <a:ext cx="5486400" cy="3526971"/>
                     </a:xfrm>
                     <a:prstGeom prst="rect"/>
                   </pic:spPr>
@@ -4312,7 +4312,7 @@
       <w:r>
         <w:drawing>
           <wp:inline xmlns:a="http://schemas.openxmlformats.org/drawingml/2006/main" xmlns:pic="http://schemas.openxmlformats.org/drawingml/2006/picture">
-            <wp:extent cx="5486400" cy="3062177"/>
+            <wp:extent cx="5486400" cy="3526971"/>
             <wp:docPr id="7" name="Picture 7"/>
             <wp:cNvGraphicFramePr>
               <a:graphicFrameLocks noChangeAspect="1"/>
@@ -4333,7 +4333,7 @@
                   <pic:spPr>
                     <a:xfrm>
                       <a:off x="0" y="0"/>
-                      <a:ext cx="5486400" cy="3062177"/>
+                      <a:ext cx="5486400" cy="3526971"/>
                     </a:xfrm>
                     <a:prstGeom prst="rect"/>
                   </pic:spPr>

</xml_diff>